<commit_message>
Deploy preview for PR 545 🛫
</commit_message>
<xml_diff>
--- a/pr-preview/pr-545/vignettes/articles/version-crosswalk-1.3-to-1.4.docx
+++ b/pr-preview/pr-545/vignettes/articles/version-crosswalk-1.3-to-1.4.docx
@@ -23,7 +23,7 @@
         <w:pStyle w:val="Date"/>
       </w:pPr>
       <w:r>
-        <w:t xml:space="preserve">2026-08-10</w:t>
+        <w:t xml:space="preserve">2026-10-08</w:t>
       </w:r>
     </w:p>
     <w:bookmarkStart w:id="9" w:name="overview"/>
@@ -3049,7 +3049,7 @@
         <w:rPr>
           <w:rStyle w:val="CommentTok"/>
         </w:rPr>
-        <w:t xml:space="preserve">#&gt;     age id    antigen_iso   value</w:t>
+        <w:t xml:space="preserve">#&gt;     age id    antigen_iso value</w:t>
       </w:r>
       <w:r>
         <w:br/>
@@ -3058,7 +3058,7 @@
         <w:rPr>
           <w:rStyle w:val="CommentTok"/>
         </w:rPr>
-        <w:t xml:space="preserve">#&gt;   &lt;dbl&gt; &lt;chr&gt; &lt;chr&gt;         &lt;dbl&gt;</w:t>
+        <w:t xml:space="preserve">#&gt;   &lt;dbl&gt; &lt;chr&gt; &lt;chr&gt;       &lt;dbl&gt;</w:t>
       </w:r>
       <w:r>
         <w:br/>
@@ -3067,7 +3067,7 @@
         <w:rPr>
           <w:rStyle w:val="CommentTok"/>
         </w:rPr>
-        <w:t xml:space="preserve">#&gt; 1  19.0 1     HlyE_IgA      0.327</w:t>
+        <w:t xml:space="preserve">#&gt; 1  3.37 1     HlyE_IgA    0.437</w:t>
       </w:r>
       <w:r>
         <w:br/>
@@ -3076,7 +3076,7 @@
         <w:rPr>
           <w:rStyle w:val="CommentTok"/>
         </w:rPr>
-        <w:t xml:space="preserve">#&gt; 2  19.0 1     HlyE_IgG      2.11 </w:t>
+        <w:t xml:space="preserve">#&gt; 2  3.37 1     HlyE_IgG    0.825</w:t>
       </w:r>
       <w:r>
         <w:br/>
@@ -3085,7 +3085,7 @@
         <w:rPr>
           <w:rStyle w:val="CommentTok"/>
         </w:rPr>
-        <w:t xml:space="preserve">#&gt; 3  18.8 2     HlyE_IgA      1.47 </w:t>
+        <w:t xml:space="preserve">#&gt; 3  9.58 2     HlyE_IgA    0.632</w:t>
       </w:r>
       <w:r>
         <w:br/>
@@ -3094,7 +3094,7 @@
         <w:rPr>
           <w:rStyle w:val="CommentTok"/>
         </w:rPr>
-        <w:t xml:space="preserve">#&gt; 4  18.8 2     HlyE_IgG    498.   </w:t>
+        <w:t xml:space="preserve">#&gt; 4  9.58 2     HlyE_IgG    0.625</w:t>
       </w:r>
       <w:r>
         <w:br/>
@@ -3103,7 +3103,7 @@
         <w:rPr>
           <w:rStyle w:val="CommentTok"/>
         </w:rPr>
-        <w:t xml:space="preserve">#&gt; 5  14.6 3     HlyE_IgA      0.964</w:t>
+        <w:t xml:space="preserve">#&gt; 5 13.9  3     HlyE_IgA    0.629</w:t>
       </w:r>
       <w:r>
         <w:br/>
@@ -3112,7 +3112,7 @@
         <w:rPr>
           <w:rStyle w:val="CommentTok"/>
         </w:rPr>
-        <w:t xml:space="preserve">#&gt; 6  14.6 3     HlyE_IgG      3.72</w:t>
+        <w:t xml:space="preserve">#&gt; 6 13.9  3     HlyE_IgG    1.44</w:t>
       </w:r>
       <w:r>
         <w:br/>

</xml_diff>